<commit_message>
auto-snapshot 2026-06-11 11:39 (1 files)
</commit_message>
<xml_diff>
--- a/docs/proposals/PROPOSAL_data_soreang.docx
+++ b/docs/proposals/PROPOSAL_data_soreang.docx
@@ -1282,7 +1282,7 @@
           <w:spacing w:val="0"/>
           <w:color w:val="181E2A"/>
         </w:rPr>
-        <w:t xml:space="preserve">±3 bangunan usaha</w:t>
+        <w:t xml:space="preserve">±6 bangunan usaha</w:t>
       </w:r>
       <w:r>
         <w:rPr>
@@ -1520,7 +1520,7 @@
           <w:spacing w:val="0"/>
           <w:color w:val="181E2A"/>
         </w:rPr>
-        <w:t xml:space="preserve">Rp 12.000</w:t>
+        <w:t xml:space="preserve">Rp 20.000</w:t>
       </w:r>
     </w:p>
     <w:p>
@@ -1535,7 +1535,7 @@
           <w:spacing w:val="0"/>
           <w:color w:val="181E2A"/>
         </w:rPr>
-        <w:t xml:space="preserve">Rp 54.516.000</w:t>
+        <w:t xml:space="preserve">Rp 90.860.000</w:t>
       </w:r>
     </w:p>
     <w:p>
@@ -1578,7 +1578,7 @@
           <w:spacing w:val="0"/>
           <w:color w:val="181E2A"/>
         </w:rPr>
-        <w:t xml:space="preserve">Rp 3.500</w:t>
+        <w:t xml:space="preserve">Rp 5.500</w:t>
       </w:r>
     </w:p>
     <w:p>
@@ -1593,7 +1593,7 @@
           <w:spacing w:val="0"/>
           <w:color w:val="181E2A"/>
         </w:rPr>
-        <w:t xml:space="preserve">Rp 70.514.500</w:t>
+        <w:t xml:space="preserve">Rp 110.808.500</w:t>
       </w:r>
     </w:p>
     <w:p>
@@ -1674,7 +1674,7 @@
           <w:spacing w:val="0"/>
           <w:color w:val="181E2A"/>
         </w:rPr>
-        <w:t xml:space="preserve">± Rp 125.000.000</w:t>
+        <w:t xml:space="preserve">± Rp 200.000.000</w:t>
       </w:r>
       <w:r>
         <w:rPr>
@@ -1716,7 +1716,7 @@
           <w:spacing w:val="0"/>
           <w:color w:val="878787"/>
         </w:rPr>
-        <w:t xml:space="preserve">Rp 125.000.000</w:t>
+        <w:t xml:space="preserve">Rp 200.000.000</w:t>
       </w:r>
       <w:r>
         <w:rPr>
@@ -1743,7 +1743,7 @@
           <w:spacing w:val="0"/>
           <w:color w:val="172877"/>
         </w:rPr>
-        <w:t xml:space="preserve">Rp 70.000.000</w:t>
+        <w:t xml:space="preserve">Rp 150.000.000</w:t>
       </w:r>
       <w:r>
         <w:rPr>
@@ -1770,7 +1770,7 @@
           <w:spacing w:val="0"/>
           <w:color w:val="2A3140"/>
         </w:rPr>
-        <w:t xml:space="preserve">(tujuh puluh juta rupiah)</w:t>
+        <w:t xml:space="preserve">(seratus lima puluh juta rupiah)</w:t>
       </w:r>
       <w:r>
         <w:rPr>
@@ -1806,28 +1806,28 @@
           <w:spacing w:val="0"/>
           <w:color w:val="181E2A"/>
         </w:rPr>
-        <w:t xml:space="preserve">harga khusus Rp 70.000.000</w:t>
-      </w:r>
-      <w:r>
-        <w:rPr>
-          <w:rFonts w:ascii="Arial" w:hAnsi="Arial" w:cs="Arial"/>
-          <w:sz w:val="29"/>
-          <w:sz-cs w:val="29"/>
-          <w:spacing w:val="0"/>
-          <w:color w:val="181E2A"/>
-        </w:rPr>
-        <w:t xml:space="preserve"> — hemat ± Rp 55 juta dari nilai wajar, atau setara hanya </w:t>
-      </w:r>
-      <w:r>
-        <w:rPr>
-          <w:rFonts w:ascii="Arial" w:hAnsi="Arial" w:cs="Arial"/>
-          <w:sz w:val="29"/>
-          <w:sz-cs w:val="29"/>
-          <w:b/>
-          <w:spacing w:val="0"/>
-          <w:color w:val="181E2A"/>
-        </w:rPr>
-        <w:t xml:space="preserve">± Rp 2.835 per bangunan terverifikasi</w:t>
+        <w:t xml:space="preserve">harga khusus Rp 150.000.000</w:t>
+      </w:r>
+      <w:r>
+        <w:rPr>
+          <w:rFonts w:ascii="Arial" w:hAnsi="Arial" w:cs="Arial"/>
+          <w:sz w:val="29"/>
+          <w:sz-cs w:val="29"/>
+          <w:spacing w:val="0"/>
+          <w:color w:val="181E2A"/>
+        </w:rPr>
+        <w:t xml:space="preserve"> — hemat ± Rp 50 juta dari nilai wajar, atau setara hanya </w:t>
+      </w:r>
+      <w:r>
+        <w:rPr>
+          <w:rFonts w:ascii="Arial" w:hAnsi="Arial" w:cs="Arial"/>
+          <w:sz w:val="29"/>
+          <w:sz-cs w:val="29"/>
+          <w:b/>
+          <w:spacing w:val="0"/>
+          <w:color w:val="181E2A"/>
+        </w:rPr>
+        <w:t xml:space="preserve">± Rp 6.075 per bangunan terverifikasi</w:t>
       </w:r>
       <w:r>
         <w:rPr>

</xml_diff>